<commit_message>
Correct Howmet close, update Wolters Kluwer to June 2026 balance sheet, soften two claims
Co-Authored-By: Claude Opus 5.5 <noreply@anthropic.com>
Claude-Session: https://claude.ai/code/session_019FqAzuwCcyB5LAbm3EEydu
</commit_message>
<xml_diff>
--- a/deliverables/JEME_Industrials_Proposals_Schneider_Howmet_WoltersKluwer.docx
+++ b/deliverables/JEME_Industrials_Proposals_Schneider_Howmet_WoltersKluwer.docx
@@ -5477,7 +5477,7 @@
           <w:sz w:val="18"/>
           <w:szCs w:val="18"/>
         </w:rPr>
-        <w:t xml:space="preserve"> The base case earns about 13% (11.5% price plus 1.8% dividends; €4.50 assumed against €4.20 paid in May 2026). We think the market treats the 2027 dilution as permanent and the AI build-out as fragile. The dilution unwinds once PTC is consolidated, and Schneider describes data-centre visibility into 2027–28 </w:t>
+        <w:t xml:space="preserve"> The base case earns about 13% (11.5% price plus 1.8% dividends; €4.50 assumed against €4.20 paid in May 2026). We think the market treats the 2027 dilution as permanent and the AI build-out as fragile. PTC’s earnings are expected to offset the EPS dilution once consolidated, and Schneider describes data-centre visibility into 2027–28 </w:t>
       </w:r>
       <w:r>
         <w:rPr>
@@ -6607,7 +6607,7 @@
                 <w:sz w:val="17"/>
                 <w:szCs w:val="17"/>
               </w:rPr>
-              <w:t xml:space="preserve">BUY at $194.56</w:t>
+              <w:t xml:space="preserve">BUY at $195.19</w:t>
             </w:r>
             <w:r>
               <w:rPr>
@@ -6654,7 +6654,7 @@
                 <w:sz w:val="17"/>
                 <w:szCs w:val="17"/>
               </w:rPr>
-              <w:t xml:space="preserve">. Base twelve-month value $220 (+12.9%); dividends are small and excluded.</w:t>
+              <w:t xml:space="preserve">. Base twelve-month value $220 (+12.5%); dividends are small and excluded.</w:t>
             </w:r>
           </w:p>
         </w:tc>
@@ -8790,7 +8790,7 @@
           <w:sz w:val="18"/>
           <w:szCs w:val="18"/>
         </w:rPr>
-        <w:t xml:space="preserve">Price check.</w:t>
+        <w:t xml:space="preserve">Price basis.</w:t>
       </w:r>
       <w:r>
         <w:rPr>
@@ -8799,7 +8799,7 @@
           <w:sz w:val="18"/>
           <w:szCs w:val="18"/>
         </w:rPr>
-        <w:t xml:space="preserve"> $194.56 is the 28 October close, $2.57 (+1.34%) above the $191.99 close of 27 October </w:t>
+        <w:t xml:space="preserve"> We use $195.19, the 28 October close reported by the FT, Investing.com and Stock Analysis </w:t>
       </w:r>
       <w:r>
         <w:rPr>
@@ -8837,7 +8837,7 @@
           <w:sz w:val="18"/>
           <w:szCs w:val="18"/>
         </w:rPr>
-        <w:t xml:space="preserve">. A $195.19 figure in some data snapshots does not match any close and appears to be an intraday quote. Because the price predates the 29 October release, the raised guidance is not in it.</w:t>
+        <w:t xml:space="preserve">; one aggregator showed $194.56. The valuation uses the closing price before the results announcement; the subsequent market reaction is excluded. Investors may already have anticipated stronger results.</w:t>
       </w:r>
     </w:p>
     <w:tbl>
@@ -9875,7 +9875,7 @@
                 <w:sz w:val="16"/>
                 <w:szCs w:val="16"/>
               </w:rPr>
-              <w:t xml:space="preserve">$194.56</w:t>
+              <w:t xml:space="preserve">$195.19</w:t>
             </w:r>
           </w:p>
         </w:tc>
@@ -9983,7 +9983,7 @@
                 <w:sz w:val="16"/>
                 <w:szCs w:val="16"/>
               </w:rPr>
-              <w:t xml:space="preserve">35.4x</w:t>
+              <w:t xml:space="preserve">35.5x</w:t>
             </w:r>
           </w:p>
         </w:tc>
@@ -10876,7 +10876,7 @@
                 <w:sz w:val="16"/>
                 <w:szCs w:val="16"/>
               </w:rPr>
-              <w:t xml:space="preserve">$223.0  (+15%)</w:t>
+              <w:t xml:space="preserve">$223.0  (+14%)</w:t>
             </w:r>
           </w:p>
         </w:tc>
@@ -11061,7 +11061,7 @@
                 <w:sz w:val="16"/>
                 <w:szCs w:val="16"/>
               </w:rPr>
-              <w:t xml:space="preserve">$219.6  (+13%)</w:t>
+              <w:t xml:space="preserve">$219.6  (+12.5%)</w:t>
             </w:r>
           </w:p>
         </w:tc>
@@ -11097,7 +11097,7 @@
                 <w:sz w:val="16"/>
                 <w:szCs w:val="16"/>
               </w:rPr>
-              <w:t xml:space="preserve">$256.2  (+32%)</w:t>
+              <w:t xml:space="preserve">$256.2  (+31%)</w:t>
             </w:r>
           </w:p>
         </w:tc>
@@ -11242,7 +11242,7 @@
                 <w:sz w:val="16"/>
                 <w:szCs w:val="16"/>
               </w:rPr>
-              <w:t xml:space="preserve">$194.2  (0%)</w:t>
+              <w:t xml:space="preserve">$194.2  (−1%)</w:t>
             </w:r>
           </w:p>
         </w:tc>
@@ -11277,7 +11277,7 @@
                 <w:sz w:val="16"/>
                 <w:szCs w:val="16"/>
               </w:rPr>
-              <w:t xml:space="preserve">$233.1  (+20%)</w:t>
+              <w:t xml:space="preserve">$233.1  (+19%)</w:t>
             </w:r>
           </w:p>
         </w:tc>
@@ -11312,7 +11312,7 @@
                 <w:sz w:val="16"/>
                 <w:szCs w:val="16"/>
               </w:rPr>
-              <w:t xml:space="preserve">$271.9  (+40%)</w:t>
+              <w:t xml:space="preserve">$271.9  (+39%)</w:t>
             </w:r>
           </w:p>
         </w:tc>
@@ -11331,7 +11331,7 @@
           <w:sz w:val="14"/>
           <w:szCs w:val="14"/>
         </w:rPr>
-        <w:t xml:space="preserve">Twelve-month exit values (October 2027, on FY2028 EPS) against $194.56. Base cell 30x: today’s multiple on our 2027 EPS, inside the 27–37x peer range and well below where the shares traded at their high. No probabilities assigned.</w:t>
+        <w:t xml:space="preserve">Twelve-month exit values (October 2027, on FY2028 EPS) against $195.19. Base cell 30x: today’s multiple on our 2027 EPS, inside the 27–37x peer range and well below where the shares traded at their high. No probabilities assigned.</w:t>
       </w:r>
     </w:p>
     <w:p>
@@ -11356,7 +11356,7 @@
           <w:sz w:val="18"/>
           <w:szCs w:val="18"/>
         </w:rPr>
-        <w:t xml:space="preserve"> The base case earns about 13%, all of it from earnings growth. We think the market is extrapolating the October sector sell-off rather than Howmet’s own numbers: it raised guidance again and bought back $1.1bn of shares this year at higher prices </w:t>
+        <w:t xml:space="preserve"> The base case earns about 12.5%, all of it from earnings growth. We think the market is extrapolating the October sector sell-off rather than Howmet’s own numbers: it raised guidance again and bought back $1.1bn of shares this year at higher prices </w:t>
       </w:r>
       <w:r>
         <w:rPr>
@@ -12266,7 +12266,7 @@
                 <w:sz w:val="15"/>
                 <w:szCs w:val="15"/>
               </w:rPr>
-              <w:t xml:space="preserve">  35.4x vs 32.4x selected-peer median; no industry average</w:t>
+              <w:t xml:space="preserve">  35.5x vs 32.4x selected-peer median; no industry average</w:t>
             </w:r>
           </w:p>
         </w:tc>
@@ -14797,7 +14797,7 @@
           <w:sz w:val="18"/>
           <w:szCs w:val="18"/>
         </w:rPr>
-        <w:t xml:space="preserve"> Equity fell from €1,545m to €798m in 2025 as buybacks and dividends exceeded comprehensive income, while net debt rose to €4.0bn (2.0x EBITDA) </w:t>
+        <w:t xml:space="preserve"> Equity fell from €1,545m to €798m in 2025 as buybacks and dividends exceeded comprehensive income </w:t>
       </w:r>
       <w:r>
         <w:rPr>
@@ -14835,7 +14835,45 @@
           <w:sz w:val="18"/>
           <w:szCs w:val="18"/>
         </w:rPr>
-        <w:t xml:space="preserve">. That inflates ROE (about 112%), debt/equity (6.0x) and P/B (about 24x). Net debt to EBITDA and interest cover of about 20x are the more useful leverage measures, and both are moderate.</w:t>
+        <w:t xml:space="preserve">. At 30 June 2026 equity was €940m and net debt €4,024m, unchanged from December at 2.0x EBITDA </w:t>
+      </w:r>
+      <w:r>
+        <w:rPr>
+          <w:rFonts w:ascii="Quicksand Light" w:cs="Quicksand Light" w:eastAsia="Quicksand Light" w:hAnsi="Quicksand Light"/>
+          <w:color w:val="615F59"/>
+          <w:sz w:val="15"/>
+          <w:szCs w:val="15"/>
+        </w:rPr>
+        <w:t xml:space="preserve">[</w:t>
+      </w:r>
+      <w:hyperlink w:history="1" w:anchor="src_W22">
+        <w:r>
+          <w:rPr>
+            <w:rFonts w:ascii="Quicksand Light" w:cs="Quicksand Light" w:eastAsia="Quicksand Light" w:hAnsi="Quicksand Light"/>
+            <w:color w:val="615F59"/>
+            <w:sz w:val="15"/>
+            <w:szCs w:val="15"/>
+          </w:rPr>
+          <w:t xml:space="preserve">W22</w:t>
+        </w:r>
+      </w:hyperlink>
+      <w:r>
+        <w:rPr>
+          <w:rFonts w:ascii="Quicksand Light" w:cs="Quicksand Light" w:eastAsia="Quicksand Light" w:hAnsi="Quicksand Light"/>
+          <w:color w:val="615F59"/>
+          <w:sz w:val="15"/>
+          <w:szCs w:val="15"/>
+        </w:rPr>
+        <w:t xml:space="preserve">]</w:t>
+      </w:r>
+      <w:r>
+        <w:rPr>
+          <w:rFonts w:ascii="Quicksand Light" w:cs="Quicksand Light" w:eastAsia="Quicksand Light" w:hAnsi="Quicksand Light"/>
+          <w:color w:val="000000"/>
+          <w:sz w:val="18"/>
+          <w:szCs w:val="18"/>
+        </w:rPr>
+        <w:t xml:space="preserve">. That inflates ROE (about 112% for 2025), debt/equity (5.9x in June) and P/B (about 21x). Net debt to EBITDA and interest cover of about 20x are the more useful leverage measures, and both are moderate.</w:t>
       </w:r>
     </w:p>
     <w:tbl>
@@ -17191,7 +17229,7 @@
                 <w:sz w:val="15"/>
                 <w:szCs w:val="15"/>
               </w:rPr>
-              <w:t xml:space="preserve">  6.0x (December 2025 borrowings €4.76bn ÷ equity €0.80bn) </w:t>
+              <w:t xml:space="preserve">  5.9x (June 2026 gross debt €5.55bn ÷ equity €0.94bn); about 5.7x excluding leases </w:t>
             </w:r>
             <w:r>
               <w:rPr>
@@ -17202,7 +17240,7 @@
               </w:rPr>
               <w:t xml:space="preserve">[</w:t>
             </w:r>
-            <w:hyperlink w:history="1" w:anchor="src_W4">
+            <w:hyperlink w:history="1" w:anchor="src_W22">
               <w:r>
                 <w:rPr>
                   <w:rFonts w:ascii="Quicksand Light" w:cs="Quicksand Light" w:eastAsia="Quicksand Light" w:hAnsi="Quicksand Light"/>
@@ -17210,7 +17248,7 @@
                   <w:sz w:val="12"/>
                   <w:szCs w:val="12"/>
                 </w:rPr>
-                <w:t xml:space="preserve">W4</w:t>
+                <w:t xml:space="preserve">W22</w:t>
               </w:r>
             </w:hyperlink>
             <w:r>
@@ -17599,7 +17637,7 @@
                 <w:sz w:val="15"/>
                 <w:szCs w:val="15"/>
               </w:rPr>
-              <w:t xml:space="preserve">  about 24x; not meaningful after buybacks</w:t>
+              <w:t xml:space="preserve">  about 21x (June 2026 equity); not meaningful after buybacks</w:t>
             </w:r>
           </w:p>
         </w:tc>
@@ -17618,7 +17656,7 @@
           <w:sz w:val="14"/>
           <w:szCs w:val="14"/>
         </w:rPr>
-        <w:t xml:space="preserve">Same definitions as for Schneider Electric. The latest Wolters Kluwer balance sheet available to us is December 2025.</w:t>
+        <w:t xml:space="preserve">Same definitions as for Schneider Electric; balance-sheet ratios use the 30 June 2026 interim report. June gross debt includes a €500m bond issued on 22 June to refinance one repaid on 2 July.</w:t>
       </w:r>
     </w:p>
     <w:p>
@@ -17736,7 +17774,7 @@
         </w:rPr>
         <w:t xml:space="preserve">IEA, Energy and AI, executive summary: data-centre electricity to about 945 TWh by 2030. </w:t>
       </w:r>
-      <w:hyperlink w:history="1" r:id="rIdmuejgcvdq6zwsrmit15ds">
+      <w:hyperlink w:history="1" r:id="rIdig4ndyek9nohfvkkterke">
         <w:r>
           <w:rPr>
             <w:rFonts w:ascii="Quicksand Light" w:cs="Quicksand Light" w:eastAsia="Quicksand Light" w:hAnsi="Quicksand Light"/>
@@ -17774,7 +17812,7 @@
         </w:rPr>
         <w:t xml:space="preserve">24/7 Wall St, market report on AI-infrastructure stocks (22 October 2026). </w:t>
       </w:r>
-      <w:hyperlink w:history="1" r:id="rIdmktmhwybss9luifsshg4b">
+      <w:hyperlink w:history="1" r:id="rId2bychqigrzwoibv92ufoa">
         <w:r>
           <w:rPr>
             <w:rFonts w:ascii="Quicksand Light" w:cs="Quicksand Light" w:eastAsia="Quicksand Light" w:hAnsi="Quicksand Light"/>
@@ -17812,7 +17850,7 @@
         </w:rPr>
         <w:t xml:space="preserve">Meta, third-quarter 2026 results (21 October 2026): 2026 capital expenditure outlook. </w:t>
       </w:r>
-      <w:hyperlink w:history="1" r:id="rIdtciclkq5c-0ckbsiawpyd">
+      <w:hyperlink w:history="1" r:id="rIdrvdp9jhgwedafsgurhlh4">
         <w:r>
           <w:rPr>
             <w:rFonts w:ascii="Quicksand Light" w:cs="Quicksand Light" w:eastAsia="Quicksand Light" w:hAnsi="Quicksand Light"/>
@@ -17850,7 +17888,7 @@
         </w:rPr>
         <w:t xml:space="preserve">Alphabet, Q3 2026 results, Form 8-K Exhibit 99.1 (28 October 2026), and call commentary on 2026–27 capex. </w:t>
       </w:r>
-      <w:hyperlink w:history="1" r:id="rIdzrz4rey8p718bfb2mghoa">
+      <w:hyperlink w:history="1" r:id="rIdmy3sk_pfqzrywm6hq5-iw">
         <w:r>
           <w:rPr>
             <w:rFonts w:ascii="Quicksand Light" w:cs="Quicksand Light" w:eastAsia="Quicksand Light" w:hAnsi="Quicksand Light"/>
@@ -17903,7 +17941,7 @@
         </w:rPr>
         <w:t xml:space="preserve">Schneider Electric, 2025 full-year results release (26 February 2026): revenue, net income, EPS, FCF €4,635m (+10%), cash conversion. </w:t>
       </w:r>
-      <w:hyperlink w:history="1" r:id="rIdfdc9vnbgdqs-cjnez4zar">
+      <w:hyperlink w:history="1" r:id="rIdb7rpj7vrz49h6arlakaxj">
         <w:r>
           <w:rPr>
             <w:rFonts w:ascii="Quicksand Light" w:cs="Quicksand Light" w:eastAsia="Quicksand Light" w:hAnsi="Quicksand Light"/>
@@ -17941,7 +17979,7 @@
         </w:rPr>
         <w:t xml:space="preserve">Schneider Electric, 2026 half-year results release (July 2026): net income, adjusted EPS, FCF, margin, net debt. </w:t>
       </w:r>
-      <w:hyperlink w:history="1" r:id="rIdneqpiw8bv8xfwueiii0t_">
+      <w:hyperlink w:history="1" r:id="rIdhszf1qodajfbstq4ppovm">
         <w:r>
           <w:rPr>
             <w:rFonts w:ascii="Quicksand Light" w:cs="Quicksand Light" w:eastAsia="Quicksand Light" w:hAnsi="Quicksand Light"/>
@@ -17979,7 +18017,7 @@
         </w:rPr>
         <w:t xml:space="preserve">Schneider Electric, Q3 2026 revenues release (16 October 2026): organic growth by business, 2026 targets. </w:t>
       </w:r>
-      <w:hyperlink w:history="1" r:id="rIdians8syhvitpoq8kdkbkz">
+      <w:hyperlink w:history="1" r:id="rIdfk2-itjtutxx3nsi4jpmg">
         <w:r>
           <w:rPr>
             <w:rFonts w:ascii="Quicksand Light" w:cs="Quicksand Light" w:eastAsia="Quicksand Light" w:hAnsi="Quicksand Light"/>
@@ -18017,7 +18055,7 @@
         </w:rPr>
         <w:t xml:space="preserve">PTC / Schneider Electric, acquisition announcement (5 October 2026): price, financing plan, timing, accretion, synergies. </w:t>
       </w:r>
-      <w:hyperlink w:history="1" r:id="rIdrhqi2crap9lwsrugwlkt_">
+      <w:hyperlink w:history="1" r:id="rId-lk6ly2ucgn402wgu94ko">
         <w:r>
           <w:rPr>
             <w:rFonts w:ascii="Quicksand Light" w:cs="Quicksand Light" w:eastAsia="Quicksand Light" w:hAnsi="Quicksand Light"/>
@@ -18055,7 +18093,7 @@
         </w:rPr>
         <w:t xml:space="preserve">MarketScreener (Reuters), "Schneider Electric raises 2026 targets again" (16 October 2026): data-centre demand, backlog, visibility. </w:t>
       </w:r>
-      <w:hyperlink w:history="1" r:id="rIduad2piq9otk6er9ailcbr">
+      <w:hyperlink w:history="1" r:id="rIdknpeixrjk_zluntdbfqtt">
         <w:r>
           <w:rPr>
             <w:rFonts w:ascii="Quicksand Light" w:cs="Quicksand Light" w:eastAsia="Quicksand Light" w:hAnsi="Quicksand Light"/>
@@ -18093,7 +18131,7 @@
         </w:rPr>
         <w:t xml:space="preserve">Schneider Electric, broker consensus compiled after H1 2026 (11 August 2026). </w:t>
       </w:r>
-      <w:hyperlink w:history="1" r:id="rIdbo4otcwuxgib6eel039pl">
+      <w:hyperlink w:history="1" r:id="rIduegvrn3g-djnkivun2rxt">
         <w:r>
           <w:rPr>
             <w:rFonts w:ascii="Quicksand Light" w:cs="Quicksand Light" w:eastAsia="Quicksand Light" w:hAnsi="Quicksand Light"/>
@@ -18131,7 +18169,7 @@
         </w:rPr>
         <w:t xml:space="preserve">Morningstar, Schneider earnings note: data centres about 29% of 2025 revenue (analyst estimate). </w:t>
       </w:r>
-      <w:hyperlink w:history="1" r:id="rIdzf6rctzvnf8x1laoqbowd">
+      <w:hyperlink w:history="1" r:id="rId1eughdua_hssaivybi_oh">
         <w:r>
           <w:rPr>
             <w:rFonts w:ascii="Quicksand Light" w:cs="Quicksand Light" w:eastAsia="Quicksand Light" w:hAnsi="Quicksand Light"/>
@@ -18169,7 +18207,7 @@
         </w:rPr>
         <w:t xml:space="preserve">Schneider Electric, 2025 full-year presentation: order mix by end market. </w:t>
       </w:r>
-      <w:hyperlink w:history="1" r:id="rId6vyvjtehnd871hrpcthqh">
+      <w:hyperlink w:history="1" r:id="rIdpa8h4lekdlvs-jifhgwix">
         <w:r>
           <w:rPr>
             <w:rFonts w:ascii="Quicksand Light" w:cs="Quicksand Light" w:eastAsia="Quicksand Light" w:hAnsi="Quicksand Light"/>
@@ -18207,7 +18245,7 @@
         </w:rPr>
         <w:t xml:space="preserve">MarketScreener, Schneider Electric quotes: 28 October 2026 close €246.20. </w:t>
       </w:r>
-      <w:hyperlink w:history="1" r:id="rIdk9s7t5kxuhrvv3qoqsfod">
+      <w:hyperlink w:history="1" r:id="rId90aqimrc2elxbwo9lmet2">
         <w:r>
           <w:rPr>
             <w:rFonts w:ascii="Quicksand Light" w:cs="Quicksand Light" w:eastAsia="Quicksand Light" w:hAnsi="Quicksand Light"/>
@@ -18245,7 +18283,7 @@
         </w:rPr>
         <w:t xml:space="preserve">Stock Analysis, Schneider Electric income statement: 2021–2025 net income and diluted EPS. </w:t>
       </w:r>
-      <w:hyperlink w:history="1" r:id="rIdjcd-o_swpfxjxiz1renpr">
+      <w:hyperlink w:history="1" r:id="rIdinhznvu7hdx5lxtuiabg5">
         <w:r>
           <w:rPr>
             <w:rFonts w:ascii="Quicksand Light" w:cs="Quicksand Light" w:eastAsia="Quicksand Light" w:hAnsi="Quicksand Light"/>
@@ -18283,7 +18321,7 @@
         </w:rPr>
         <w:t xml:space="preserve">PTC, fiscal 2025 results (5 November 2025): ARR $2.48bn. </w:t>
       </w:r>
-      <w:hyperlink w:history="1" r:id="rId_ja1rinlzkjscsfjs3rum">
+      <w:hyperlink w:history="1" r:id="rIdaivghgfnvjzggos0w24u_">
         <w:r>
           <w:rPr>
             <w:rFonts w:ascii="Quicksand Light" w:cs="Quicksand Light" w:eastAsia="Quicksand Light" w:hAnsi="Quicksand Light"/>
@@ -18321,7 +18359,7 @@
         </w:rPr>
         <w:t xml:space="preserve">Schneider Electric, capital increase release (20 October 2026): 25,000,000 new shares at €240. </w:t>
       </w:r>
-      <w:hyperlink w:history="1" r:id="rIdlc6vt5srovplo_ncnxnjx">
+      <w:hyperlink w:history="1" r:id="rIddiggbmytdc1ft89rl4mmv">
         <w:r>
           <w:rPr>
             <w:rFonts w:ascii="Quicksand Light" w:cs="Quicksand Light" w:eastAsia="Quicksand Light" w:hAnsi="Quicksand Light"/>
@@ -18359,7 +18397,7 @@
         </w:rPr>
         <w:t xml:space="preserve">Finanzwire, "Successful issue of a €6.0 billion bond as part of the financing of the PTC acquisition" (October 2026): tranches and coupons. </w:t>
       </w:r>
-      <w:hyperlink w:history="1" r:id="rIdv29kt3chrd7t82pfxgtde">
+      <w:hyperlink w:history="1" r:id="rId3obgkxikht9gpeiuktegx">
         <w:r>
           <w:rPr>
             <w:rFonts w:ascii="Quicksand Light" w:cs="Quicksand Light" w:eastAsia="Quicksand Light" w:hAnsi="Quicksand Light"/>
@@ -18397,7 +18435,7 @@
         </w:rPr>
         <w:t xml:space="preserve">Schneider Electric, 2023 full-year presentation: free cash flow €4.6bn. </w:t>
       </w:r>
-      <w:hyperlink w:history="1" r:id="rIdwnypx_3ggy2ep5mxt_4ze">
+      <w:hyperlink w:history="1" r:id="rIdvuyrr4jrihzmjzgjxw9h7">
         <w:r>
           <w:rPr>
             <w:rFonts w:ascii="Quicksand Light" w:cs="Quicksand Light" w:eastAsia="Quicksand Light" w:hAnsi="Quicksand Light"/>
@@ -18435,7 +18473,7 @@
         </w:rPr>
         <w:t xml:space="preserve">Schneider Electric, 2024 consolidated financial statements: equity attributable to owners (restated €30,416m in the 2026 interim). </w:t>
       </w:r>
-      <w:hyperlink w:history="1" r:id="rIdmgggxejcyoutvmdfbs64h">
+      <w:hyperlink w:history="1" r:id="rIdhz4lwdwtu3mhxhd0i3a7m">
         <w:r>
           <w:rPr>
             <w:rFonts w:ascii="Quicksand Light" w:cs="Quicksand Light" w:eastAsia="Quicksand Light" w:hAnsi="Quicksand Light"/>
@@ -18473,7 +18511,7 @@
         </w:rPr>
         <w:t xml:space="preserve">MarketScreener, Schneider Electric 2026 half-year financial statements, Note 15: financial liabilities €19,390m. </w:t>
       </w:r>
-      <w:hyperlink w:history="1" r:id="rIdcdipwox-hzuxnm3-ysahp">
+      <w:hyperlink w:history="1" r:id="rIdmkoj_16mgg2y1uftytu_m">
         <w:r>
           <w:rPr>
             <w:rFonts w:ascii="Quicksand Light" w:cs="Quicksand Light" w:eastAsia="Quicksand Light" w:hAnsi="Quicksand Light"/>
@@ -18511,7 +18549,7 @@
         </w:rPr>
         <w:t xml:space="preserve">PTC, fiscal 2025 results, Form 8-K Exhibit 99.1: revenue $2,739m. </w:t>
       </w:r>
-      <w:hyperlink w:history="1" r:id="rIdsfi90yulb5rek0tarn1qr">
+      <w:hyperlink w:history="1" r:id="rIdg0rfmlu05tmcvgkmoytku">
         <w:r>
           <w:rPr>
             <w:rFonts w:ascii="Quicksand Light" w:cs="Quicksand Light" w:eastAsia="Quicksand Light" w:hAnsi="Quicksand Light"/>
@@ -18549,7 +18587,7 @@
         </w:rPr>
         <w:t xml:space="preserve">Investing.com, Schneider Electric earnings calendar (next results 18 February 2027) and Yahoo Finance analyst estimates. </w:t>
       </w:r>
-      <w:hyperlink w:history="1" r:id="rIdyk1226qcqogwidkaq4fot">
+      <w:hyperlink w:history="1" r:id="rIdejjzxc3pzxpd68tjgboy3">
         <w:r>
           <w:rPr>
             <w:rFonts w:ascii="Quicksand Light" w:cs="Quicksand Light" w:eastAsia="Quicksand Light" w:hAnsi="Quicksand Light"/>
@@ -18587,7 +18625,7 @@
         </w:rPr>
         <w:t xml:space="preserve">Eaton, Q2 2026 results, Form 8-K Exhibit 99 (31 July 2026): 2026 adjusted EPS guidance $13.40–13.60. </w:t>
       </w:r>
-      <w:hyperlink w:history="1" r:id="rIdtraj15m9pvucmugvfks-w">
+      <w:hyperlink w:history="1" r:id="rIdqt-n3zrj8ulufnnqktixm">
         <w:r>
           <w:rPr>
             <w:rFonts w:ascii="Quicksand Light" w:cs="Quicksand Light" w:eastAsia="Quicksand Light" w:hAnsi="Quicksand Light"/>
@@ -18625,7 +18663,7 @@
         </w:rPr>
         <w:t xml:space="preserve">Hubbell, Q3 2026 results, Form 8-K Exhibit 99.1 (27 October 2026): 2026 adjusted EPS guidance $20.40–20.60. </w:t>
       </w:r>
-      <w:hyperlink w:history="1" r:id="rIdrsbz-tjyj6nxt45iac8ip">
+      <w:hyperlink w:history="1" r:id="rIdrlyowa5pq3bm5954064fw">
         <w:r>
           <w:rPr>
             <w:rFonts w:ascii="Quicksand Light" w:cs="Quicksand Light" w:eastAsia="Quicksand Light" w:hAnsi="Quicksand Light"/>
@@ -18663,7 +18701,7 @@
         </w:rPr>
         <w:t xml:space="preserve">Vertiv, Q3 2026 results, Form 8-K Exhibit 99.1 (28 October 2026): 2026 adjusted EPS guidance $7.15. </w:t>
       </w:r>
-      <w:hyperlink w:history="1" r:id="rIddj1au33uorjtfjfplhfli">
+      <w:hyperlink w:history="1" r:id="rIdocntqds12o_0sxo-fm1zm">
         <w:r>
           <w:rPr>
             <w:rFonts w:ascii="Quicksand Light" w:cs="Quicksand Light" w:eastAsia="Quicksand Light" w:hAnsi="Quicksand Light"/>
@@ -18701,7 +18739,7 @@
         </w:rPr>
         <w:t xml:space="preserve">MarketChameleon, Eaton: 28 October 2026 close $392.88. </w:t>
       </w:r>
-      <w:hyperlink w:history="1" r:id="rIdq3zgowvziqortlhxazu7q">
+      <w:hyperlink w:history="1" r:id="rIdq0tvqchyjxzzmdoy5mnh9">
         <w:r>
           <w:rPr>
             <w:rFonts w:ascii="Quicksand Light" w:cs="Quicksand Light" w:eastAsia="Quicksand Light" w:hAnsi="Quicksand Light"/>
@@ -18739,7 +18777,7 @@
         </w:rPr>
         <w:t xml:space="preserve">HeyGoTrade, Hubbell: 28 October 2026 close $437.33. </w:t>
       </w:r>
-      <w:hyperlink w:history="1" r:id="rIdatrwzao_hseiuhlc8993n">
+      <w:hyperlink w:history="1" r:id="rIdb_0avztroyl6oqrxig-te">
         <w:r>
           <w:rPr>
             <w:rFonts w:ascii="Quicksand Light" w:cs="Quicksand Light" w:eastAsia="Quicksand Light" w:hAnsi="Quicksand Light"/>
@@ -18777,7 +18815,7 @@
         </w:rPr>
         <w:t xml:space="preserve">Stock Analysis, Vertiv: 28 October 2026 close $242.94. </w:t>
       </w:r>
-      <w:hyperlink w:history="1" r:id="rIdp3flliyccina-v4etvv9h">
+      <w:hyperlink w:history="1" r:id="rIdfvrvnkskzlgzvf68esqe8">
         <w:r>
           <w:rPr>
             <w:rFonts w:ascii="Quicksand Light" w:cs="Quicksand Light" w:eastAsia="Quicksand Light" w:hAnsi="Quicksand Light"/>
@@ -18830,7 +18868,7 @@
         </w:rPr>
         <w:t xml:space="preserve">Howmet, Q3 2026 results, Form 8-K Exhibit 99.1 (29 October 2026): segments, EPS, FCF, buybacks, 2027 outlook. </w:t>
       </w:r>
-      <w:hyperlink w:history="1" r:id="rId3ltuxbodzvwcso20we-pq">
+      <w:hyperlink w:history="1" r:id="rIdhywrsbq2l50gez5jkncrz">
         <w:r>
           <w:rPr>
             <w:rFonts w:ascii="Quicksand Light" w:cs="Quicksand Light" w:eastAsia="Quicksand Light" w:hAnsi="Quicksand Light"/>
@@ -18868,7 +18906,7 @@
         </w:rPr>
         <w:t xml:space="preserve">Howmet, full-year 2025 results (12 February 2026): revenue, EPS, adjusted EPS, FCF, capex. </w:t>
       </w:r>
-      <w:hyperlink w:history="1" r:id="rIdwpqneo9u55rut0lsujxus">
+      <w:hyperlink w:history="1" r:id="rIdqq3ywupze4bfrsfugghee">
         <w:r>
           <w:rPr>
             <w:rFonts w:ascii="Quicksand Light" w:cs="Quicksand Light" w:eastAsia="Quicksand Light" w:hAnsi="Quicksand Light"/>
@@ -18906,7 +18944,7 @@
         </w:rPr>
         <w:t xml:space="preserve">Howmet, Form 10-K for 2025: balance sheet and interest expense. </w:t>
       </w:r>
-      <w:hyperlink w:history="1" r:id="rIdmlymxigjdfszxf5kqmblj">
+      <w:hyperlink w:history="1" r:id="rIdilzqyk6lliyelrwhewqcg">
         <w:r>
           <w:rPr>
             <w:rFonts w:ascii="Quicksand Light" w:cs="Quicksand Light" w:eastAsia="Quicksand Light" w:hAnsi="Quicksand Light"/>
@@ -18944,7 +18982,7 @@
         </w:rPr>
         <w:t xml:space="preserve">Howmet, full-year 2023 results: revenue, net income, OCF $901m, FCF $682m. </w:t>
       </w:r>
-      <w:hyperlink w:history="1" r:id="rIdab919vrnvkbtvv0vginp9">
+      <w:hyperlink w:history="1" r:id="rIdcu-k7zjtilg0zt93z5ktw">
         <w:r>
           <w:rPr>
             <w:rFonts w:ascii="Quicksand Light" w:cs="Quicksand Light" w:eastAsia="Quicksand Light" w:hAnsi="Quicksand Light"/>
@@ -18982,7 +19020,7 @@
         </w:rPr>
         <w:t xml:space="preserve">Howmet, full-year 2024 results: revenue, operating margin 22.0%, FCF $977m. </w:t>
       </w:r>
-      <w:hyperlink w:history="1" r:id="rIdpxue6x2r8jfy4kiuhfqpw">
+      <w:hyperlink w:history="1" r:id="rIdphkihxjmb8h-m9xm3hou6">
         <w:r>
           <w:rPr>
             <w:rFonts w:ascii="Quicksand Light" w:cs="Quicksand Light" w:eastAsia="Quicksand Light" w:hAnsi="Quicksand Light"/>
@@ -19020,7 +19058,7 @@
         </w:rPr>
         <w:t xml:space="preserve">Howmet, full-year 2021 results: 2021 EPS $0.59; 2020 continuing EPS $0.48. </w:t>
       </w:r>
-      <w:hyperlink w:history="1" r:id="rIduxubtk6wobwbhh55ozzzh">
+      <w:hyperlink w:history="1" r:id="rIdxvfqmmt5kjzxp2fj3-v5h">
         <w:r>
           <w:rPr>
             <w:rFonts w:ascii="Quicksand Light" w:cs="Quicksand Light" w:eastAsia="Quicksand Light" w:hAnsi="Quicksand Light"/>
@@ -19056,9 +19094,9 @@
           <w:sz w:val="14"/>
           <w:szCs w:val="14"/>
         </w:rPr>
-        <w:t xml:space="preserve">MarketBeat, Howmet quote: 28 October 2026 close $194.56 (+$2.57). </w:t>
-      </w:r>
-      <w:hyperlink w:history="1" r:id="rIdjdfroyplvv0lvygucrblc">
+        <w:t xml:space="preserve">FT Markets, Howmet historical prices: 28 October 2026 close $195.19 (also Investing.com and Stock Analysis). </w:t>
+      </w:r>
+      <w:hyperlink w:history="1" r:id="rId4c9ohyyc1qxtiy2tkzuwd">
         <w:r>
           <w:rPr>
             <w:rFonts w:ascii="Quicksand Light" w:cs="Quicksand Light" w:eastAsia="Quicksand Light" w:hAnsi="Quicksand Light"/>
@@ -19067,7 +19105,7 @@
             <w:szCs w:val="13"/>
             <w:u w:val="single"/>
           </w:rPr>
-          <w:t xml:space="preserve">marketbeat.com link</w:t>
+          <w:t xml:space="preserve">markets.ft.markitdigital.com link</w:t>
         </w:r>
       </w:hyperlink>
     </w:p>
@@ -19096,7 +19134,7 @@
         </w:rPr>
         <w:t xml:space="preserve">Howmet, Q1 2026 results, Form 8-K Exhibit 99.1: completion of the CAM acquisition (6 April 2026). </w:t>
       </w:r>
-      <w:hyperlink w:history="1" r:id="rIdsxrtain8z0qw-vk6tsrmt">
+      <w:hyperlink w:history="1" r:id="rIdirrnwizacnio1pefe9wl2">
         <w:r>
           <w:rPr>
             <w:rFonts w:ascii="Quicksand Light" w:cs="Quicksand Light" w:eastAsia="Quicksand Light" w:hAnsi="Quicksand Light"/>
@@ -19134,7 +19172,7 @@
         </w:rPr>
         <w:t xml:space="preserve">Howmet, full-year 2020 results: continuing EPS $0.48, discontinued $0.11. </w:t>
       </w:r>
-      <w:hyperlink w:history="1" r:id="rIduli3hhedhkgerjotwnyi9">
+      <w:hyperlink w:history="1" r:id="rIdhmxftesy7ilrs5xq3tehf">
         <w:r>
           <w:rPr>
             <w:rFonts w:ascii="Quicksand Light" w:cs="Quicksand Light" w:eastAsia="Quicksand Light" w:hAnsi="Quicksand Light"/>
@@ -19172,7 +19210,7 @@
         </w:rPr>
         <w:t xml:space="preserve">Howmet, full-year 2022 results: OCF $733m, capex $193m. </w:t>
       </w:r>
-      <w:hyperlink w:history="1" r:id="rId2x_2iuta0ninmnblxop5f">
+      <w:hyperlink w:history="1" r:id="rIdw9p9wen99zvwmdlk1zroj">
         <w:r>
           <w:rPr>
             <w:rFonts w:ascii="Quicksand Light" w:cs="Quicksand Light" w:eastAsia="Quicksand Light" w:hAnsi="Quicksand Light"/>
@@ -19210,7 +19248,7 @@
         </w:rPr>
         <w:t xml:space="preserve">Howmet, Form 8-K (2022) reconciliation: 2021 OCF $449m, capex $199m, sold receivables $267m. </w:t>
       </w:r>
-      <w:hyperlink w:history="1" r:id="rIdymzdqx-lpo6o00anln6ed">
+      <w:hyperlink w:history="1" r:id="rIdycwciaqim-jwwkdztw7lk">
         <w:r>
           <w:rPr>
             <w:rFonts w:ascii="Quicksand Light" w:cs="Quicksand Light" w:eastAsia="Quicksand Light" w:hAnsi="Quicksand Light"/>
@@ -19248,7 +19286,7 @@
         </w:rPr>
         <w:t xml:space="preserve">Howmet, Form 10-K for 2023: operating income and net interest expense 2021–2023. </w:t>
       </w:r>
-      <w:hyperlink w:history="1" r:id="rIdaxmvslz9xewiqhd7p3s-z">
+      <w:hyperlink w:history="1" r:id="rIdmruvrb53xpu_cgdsy-shq">
         <w:r>
           <w:rPr>
             <w:rFonts w:ascii="Quicksand Light" w:cs="Quicksand Light" w:eastAsia="Quicksand Light" w:hAnsi="Quicksand Light"/>
@@ -19286,7 +19324,7 @@
         </w:rPr>
         <w:t xml:space="preserve">Minichart, reproduction of Howmet’s 29 October 2026 release: 2026 and Q4 guidance ranges. </w:t>
       </w:r>
-      <w:hyperlink w:history="1" r:id="rIdld9pd9obihd_df7cj6itc">
+      <w:hyperlink w:history="1" r:id="rIdg7mbry5e-4p4wkas4zjf_">
         <w:r>
           <w:rPr>
             <w:rFonts w:ascii="Quicksand Light" w:cs="Quicksand Light" w:eastAsia="Quicksand Light" w:hAnsi="Quicksand Light"/>
@@ -19324,7 +19362,7 @@
         </w:rPr>
         <w:t xml:space="preserve">Mining Stock Education, reproduction of the 29 October 2026 release: balance sheet at 30 September 2026. </w:t>
       </w:r>
-      <w:hyperlink w:history="1" r:id="rIdrgw5jv5z9tg-p2l8vm9mt">
+      <w:hyperlink w:history="1" r:id="rIdwgbfrf6oxtukmxzjvvy-p">
         <w:r>
           <w:rPr>
             <w:rFonts w:ascii="Quicksand Light" w:cs="Quicksand Light" w:eastAsia="Quicksand Light" w:hAnsi="Quicksand Light"/>
@@ -19362,7 +19400,7 @@
         </w:rPr>
         <w:t xml:space="preserve">Howmet, Q2 2026 results (6 August 2026): buybacks $300m at $250.61; July $200m at $276.61. </w:t>
       </w:r>
-      <w:hyperlink w:history="1" r:id="rId9nko6oulduigkpozsxau7">
+      <w:hyperlink w:history="1" r:id="rIdk7-w68rsltacb7y3iqtom">
         <w:r>
           <w:rPr>
             <w:rFonts w:ascii="Quicksand Light" w:cs="Quicksand Light" w:eastAsia="Quicksand Light" w:hAnsi="Quicksand Light"/>
@@ -19400,7 +19438,7 @@
         </w:rPr>
         <w:t xml:space="preserve">Trefis, "Howmet Aerospace stock: 5 straight red days, down 16%" (24 October 2026): $185.91 close, $310 high. </w:t>
       </w:r>
-      <w:hyperlink w:history="1" r:id="rIdfore3xbvqlkeac48hfwuo">
+      <w:hyperlink w:history="1" r:id="rIdj3ciz3jywigrpriahm-eu">
         <w:r>
           <w:rPr>
             <w:rFonts w:ascii="Quicksand Light" w:cs="Quicksand Light" w:eastAsia="Quicksand Light" w:hAnsi="Quicksand Light"/>
@@ -19438,7 +19476,7 @@
         </w:rPr>
         <w:t xml:space="preserve">Boeing, Q3 2026 results, Form 8-K Exhibit 99.1: commercial backlog $612bn. </w:t>
       </w:r>
-      <w:hyperlink w:history="1" r:id="rIdg7ygfe4r8ml71nqvsi2t9">
+      <w:hyperlink w:history="1" r:id="rIdtvicdsqdnpvvd7zvim7gd">
         <w:r>
           <w:rPr>
             <w:rFonts w:ascii="Quicksand Light" w:cs="Quicksand Light" w:eastAsia="Quicksand Light" w:hAnsi="Quicksand Light"/>
@@ -19476,7 +19514,7 @@
         </w:rPr>
         <w:t xml:space="preserve">Forecast International, Airbus and Boeing August 2026 orders and deliveries (9 September 2026). </w:t>
       </w:r>
-      <w:hyperlink w:history="1" r:id="rIdjlq2mnl4cntcsmkspmg7q">
+      <w:hyperlink w:history="1" r:id="rIddzms5jgv5ak6pb0d2ulvm">
         <w:r>
           <w:rPr>
             <w:rFonts w:ascii="Quicksand Light" w:cs="Quicksand Light" w:eastAsia="Quicksand Light" w:hAnsi="Quicksand Light"/>
@@ -19514,7 +19552,7 @@
         </w:rPr>
         <w:t xml:space="preserve">GE Aerospace, Q3 2026 results, Form 8-K (20 October 2026): orders and services backlog. </w:t>
       </w:r>
-      <w:hyperlink w:history="1" r:id="rIdzkqzqopj2jdvafywwyrwa">
+      <w:hyperlink w:history="1" r:id="rIdibry-xogfj1b-956ywcnx">
         <w:r>
           <w:rPr>
             <w:rFonts w:ascii="Quicksand Light" w:cs="Quicksand Light" w:eastAsia="Quicksand Light" w:hAnsi="Quicksand Light"/>
@@ -19552,7 +19590,7 @@
         </w:rPr>
         <w:t xml:space="preserve">Stock Analysis, GE Aerospace: 28 October 2026 close $301.13. </w:t>
       </w:r>
-      <w:hyperlink w:history="1" r:id="rIdtwx1aogelgey3wk8z68aa">
+      <w:hyperlink w:history="1" r:id="rId6f5bk2dhgi0ktxlvx_3j2">
         <w:r>
           <w:rPr>
             <w:rFonts w:ascii="Quicksand Light" w:cs="Quicksand Light" w:eastAsia="Quicksand Light" w:hAnsi="Quicksand Light"/>
@@ -19590,7 +19628,7 @@
         </w:rPr>
         <w:t xml:space="preserve">Benzinga, GE Aerospace Q3 2026 call transcript: 2026 EPS guidance $8.00–8.10. </w:t>
       </w:r>
-      <w:hyperlink w:history="1" r:id="rId3jb3fse7p6hcziuvhc803">
+      <w:hyperlink w:history="1" r:id="rIdbt5qdilxboecf5sjzkxk1">
         <w:r>
           <w:rPr>
             <w:rFonts w:ascii="Quicksand Light" w:cs="Quicksand Light" w:eastAsia="Quicksand Light" w:hAnsi="Quicksand Light"/>
@@ -19628,7 +19666,7 @@
         </w:rPr>
         <w:t xml:space="preserve">TransDigm, Q3 fiscal 2026 results, Form 8-K Exhibit 99.1: guidance midpoint raised by $1.52. </w:t>
       </w:r>
-      <w:hyperlink w:history="1" r:id="rIduteggnqunsyqe-ihlr0u1">
+      <w:hyperlink w:history="1" r:id="rId3s9bdg41qlf0q9mf-bgc2">
         <w:r>
           <w:rPr>
             <w:rFonts w:ascii="Quicksand Light" w:cs="Quicksand Light" w:eastAsia="Quicksand Light" w:hAnsi="Quicksand Light"/>
@@ -19666,7 +19704,7 @@
         </w:rPr>
         <w:t xml:space="preserve">Massive.com, TransDigm: $1,124.47 on 26 October 2026. </w:t>
       </w:r>
-      <w:hyperlink w:history="1" r:id="rIdbbw-_yv9s3i_rwqpnku0e">
+      <w:hyperlink w:history="1" r:id="rId6rnjqsxchmwkb_oksk_fp">
         <w:r>
           <w:rPr>
             <w:rFonts w:ascii="Quicksand Light" w:cs="Quicksand Light" w:eastAsia="Quicksand Light" w:hAnsi="Quicksand Light"/>
@@ -19719,7 +19757,7 @@
         </w:rPr>
         <w:t xml:space="preserve">Wolters Kluwer, 2025 full-year report (25 February 2026): FRR gain €232m, adjusted net profit €1,225m, adjusted EPS €5.29, financing costs. </w:t>
       </w:r>
-      <w:hyperlink w:history="1" r:id="rIdpkujb1aagqmhtu-opc0db">
+      <w:hyperlink w:history="1" r:id="rIdsd4xq5nbrygrakidx4-do">
         <w:r>
           <w:rPr>
             <w:rFonts w:ascii="Quicksand Light" w:cs="Quicksand Light" w:eastAsia="Quicksand Light" w:hAnsi="Quicksand Light"/>
@@ -19757,7 +19795,7 @@
         </w:rPr>
         <w:t xml:space="preserve">Wolters Kluwer, 2026 half-year report (5 August 2026): organic growth, margin, adjusted EPS, guidance. </w:t>
       </w:r>
-      <w:hyperlink w:history="1" r:id="rIdycqnaxcpn246g2zhxnt1e">
+      <w:hyperlink w:history="1" r:id="rIdtws5iiuxroflvo2d8palc">
         <w:r>
           <w:rPr>
             <w:rFonts w:ascii="Quicksand Light" w:cs="Quicksand Light" w:eastAsia="Quicksand Light" w:hAnsi="Quicksand Light"/>
@@ -19795,7 +19833,7 @@
         </w:rPr>
         <w:t xml:space="preserve">Wolters Kluwer, five-year key figures: revenue, profit, operating profit, IFRS and adjusted EPS. </w:t>
       </w:r>
-      <w:hyperlink w:history="1" r:id="rIdlfgrep1myjhcuv0ampkmp">
+      <w:hyperlink w:history="1" r:id="rIdlffhc0jorpcocdkc753lp">
         <w:r>
           <w:rPr>
             <w:rFonts w:ascii="Quicksand Light" w:cs="Quicksand Light" w:eastAsia="Quicksand Light" w:hAnsi="Quicksand Light"/>
@@ -19833,7 +19871,7 @@
         </w:rPr>
         <w:t xml:space="preserve">Wolters Kluwer, 2025 full-year results PDF: equity €798m (2024: €1,545m), gross financial debt €4,755m, net debt €4,024m. </w:t>
       </w:r>
-      <w:hyperlink w:history="1" r:id="rIdxmzcpxed-l_thma00diif">
+      <w:hyperlink w:history="1" r:id="rIdaqxgluxdszxqlwtc-zgpj">
         <w:r>
           <w:rPr>
             <w:rFonts w:ascii="Quicksand Light" w:cs="Quicksand Light" w:eastAsia="Quicksand Light" w:hAnsi="Quicksand Light"/>
@@ -19871,7 +19909,7 @@
         </w:rPr>
         <w:t xml:space="preserve">Morningstar, "Thomson Reuters, RELX and Wolters stocks crushed after Anthropic debuts Claude legal plug-in" (February 2026). </w:t>
       </w:r>
-      <w:hyperlink w:history="1" r:id="rIdhpwlyqbtvosrk1gbfokq8">
+      <w:hyperlink w:history="1" r:id="rId9fux8fiqf9ppszcyyi3zz">
         <w:r>
           <w:rPr>
             <w:rFonts w:ascii="Quicksand Light" w:cs="Quicksand Light" w:eastAsia="Quicksand Light" w:hAnsi="Quicksand Light"/>
@@ -19909,7 +19947,7 @@
         </w:rPr>
         <w:t xml:space="preserve">Twelve Data, Wolters Kluwer (Euronext) daily prices: 28 October 2026 close €83.80. </w:t>
       </w:r>
-      <w:hyperlink w:history="1" r:id="rIdknmoxaugurc7psx_t0ucm">
+      <w:hyperlink w:history="1" r:id="rId0yc7wulstqke3ud4vqgd8">
         <w:r>
           <w:rPr>
             <w:rFonts w:ascii="Quicksand Light" w:cs="Quicksand Light" w:eastAsia="Quicksand Light" w:hAnsi="Quicksand Light"/>
@@ -19947,7 +19985,7 @@
         </w:rPr>
         <w:t xml:space="preserve">Stock Analysis, Wolters Kluwer forecast (June 2026): S&amp;P Global consensus 2026 adjusted EPS €5.62; price €60. </w:t>
       </w:r>
-      <w:hyperlink w:history="1" r:id="rIdfqets8uex07hjt1oyi31h">
+      <w:hyperlink w:history="1" r:id="rIdkitz5ewokgykrktzhqo1k">
         <w:r>
           <w:rPr>
             <w:rFonts w:ascii="Quicksand Light" w:cs="Quicksand Light" w:eastAsia="Quicksand Light" w:hAnsi="Quicksand Light"/>
@@ -19985,7 +20023,7 @@
         </w:rPr>
         <w:t xml:space="preserve">RELX, trading update (22 October 2026): nine-month underlying growth by business. </w:t>
       </w:r>
-      <w:hyperlink w:history="1" r:id="rId1ptvcwrei7kl_mco5ykeb">
+      <w:hyperlink w:history="1" r:id="rId0rhm8nsmvw0srccbj1usy">
         <w:r>
           <w:rPr>
             <w:rFonts w:ascii="Quicksand Light" w:cs="Quicksand Light" w:eastAsia="Quicksand Light" w:hAnsi="Quicksand Light"/>
@@ -20023,7 +20061,7 @@
         </w:rPr>
         <w:t xml:space="preserve">Verisk, Q2 2026 results: 2026 adjusted EPS guidance $7.45–7.75 unchanged. </w:t>
       </w:r>
-      <w:hyperlink w:history="1" r:id="rIdns1tup-m2ia9pg4dd6f3h">
+      <w:hyperlink w:history="1" r:id="rIdsbjwnitv7fuwcnfm7c2gv">
         <w:r>
           <w:rPr>
             <w:rFonts w:ascii="Quicksand Light" w:cs="Quicksand Light" w:eastAsia="Quicksand Light" w:hAnsi="Quicksand Light"/>
@@ -20061,7 +20099,7 @@
         </w:rPr>
         <w:t xml:space="preserve">Yahoo Finance, Wolters Kluwer H1 2026 call highlights: UpToDate Expert AI adoption. </w:t>
       </w:r>
-      <w:hyperlink w:history="1" r:id="rIdaanhldoq2gty6bcqzofmj">
+      <w:hyperlink w:history="1" r:id="rIdgwzhulfbmatbd8btpkw39">
         <w:r>
           <w:rPr>
             <w:rFonts w:ascii="Quicksand Light" w:cs="Quicksand Light" w:eastAsia="Quicksand Light" w:hAnsi="Quicksand Light"/>
@@ -20099,7 +20137,7 @@
         </w:rPr>
         <w:t xml:space="preserve">Stock Analysis, Wolters Kluwer company profile: Industrials, Professional Services. </w:t>
       </w:r>
-      <w:hyperlink w:history="1" r:id="rId2nrzcmnrcehmqtvgqvpdf">
+      <w:hyperlink w:history="1" r:id="rId5xw971ywxvlmkpsvwlcsf">
         <w:r>
           <w:rPr>
             <w:rFonts w:ascii="Quicksand Light" w:cs="Quicksand Light" w:eastAsia="Quicksand Light" w:hAnsi="Quicksand Light"/>
@@ -20137,7 +20175,7 @@
         </w:rPr>
         <w:t xml:space="preserve">Wolters Kluwer, 2025 annual report: renewal rates for largest subscription products above 90%. </w:t>
       </w:r>
-      <w:hyperlink w:history="1" r:id="rId_erxgty2l6kum4yxvbtei">
+      <w:hyperlink w:history="1" r:id="rIdz-4g_og4trmokw3n3mui9">
         <w:r>
           <w:rPr>
             <w:rFonts w:ascii="Quicksand Light" w:cs="Quicksand Light" w:eastAsia="Quicksand Light" w:hAnsi="Quicksand Light"/>
@@ -20175,7 +20213,7 @@
         </w:rPr>
         <w:t xml:space="preserve">Investing.com, Wolters Kluwer H1 2026 earnings call transcript: AI bundling, monetisation through renewals and add-ons. </w:t>
       </w:r>
-      <w:hyperlink w:history="1" r:id="rIdhdtm5ketnkz1xxxhzmsre">
+      <w:hyperlink w:history="1" r:id="rIdmgbptnteznicdsi4oobus">
         <w:r>
           <w:rPr>
             <w:rFonts w:ascii="Quicksand Light" w:cs="Quicksand Light" w:eastAsia="Quicksand Light" w:hAnsi="Quicksand Light"/>
@@ -20213,7 +20251,7 @@
         </w:rPr>
         <w:t xml:space="preserve">Wolters Kluwer, investor calendar: nine-month 2026 trading update on 4 November 2026. </w:t>
       </w:r>
-      <w:hyperlink w:history="1" r:id="rIdmic1gxd6jrgd_eaguw4n0">
+      <w:hyperlink w:history="1" r:id="rId_uw0iyrtvrxi3klfsbq9g">
         <w:r>
           <w:rPr>
             <w:rFonts w:ascii="Quicksand Light" w:cs="Quicksand Light" w:eastAsia="Quicksand Light" w:hAnsi="Quicksand Light"/>
@@ -20251,7 +20289,7 @@
         </w:rPr>
         <w:t xml:space="preserve">Stock Analysis, RELX (London) forecast (June 2026): 2026 consensus EPS 141p. </w:t>
       </w:r>
-      <w:hyperlink w:history="1" r:id="rIdbmpmuezrohtqbzod134eo">
+      <w:hyperlink w:history="1" r:id="rIdxgpr1dcnrwkhoanxmgm-1">
         <w:r>
           <w:rPr>
             <w:rFonts w:ascii="Quicksand Light" w:cs="Quicksand Light" w:eastAsia="Quicksand Light" w:hAnsi="Quicksand Light"/>
@@ -20289,7 +20327,7 @@
         </w:rPr>
         <w:t xml:space="preserve">MarketScreener, RELX (London): 28 October 2026 close 2,891p. </w:t>
       </w:r>
-      <w:hyperlink w:history="1" r:id="rIdloa84eg9c7din39vrn96k">
+      <w:hyperlink w:history="1" r:id="rIdtb3lymn3isixbjgwrneai">
         <w:r>
           <w:rPr>
             <w:rFonts w:ascii="Quicksand Light" w:cs="Quicksand Light" w:eastAsia="Quicksand Light" w:hAnsi="Quicksand Light"/>
@@ -20327,7 +20365,7 @@
         </w:rPr>
         <w:t xml:space="preserve">Yahoo Finance, Verisk: 28 October 2026 close $189.80. </w:t>
       </w:r>
-      <w:hyperlink w:history="1" r:id="rIdahqilsi7yz2otlj9yyyvu">
+      <w:hyperlink w:history="1" r:id="rIdwui2drcmg__m8yzizgy7s">
         <w:r>
           <w:rPr>
             <w:rFonts w:ascii="Quicksand Light" w:cs="Quicksand Light" w:eastAsia="Quicksand Light" w:hAnsi="Quicksand Light"/>
@@ -20345,7 +20383,7 @@
         <w:spacing w:after="6" w:before="0" w:line="204" w:lineRule="auto"/>
         <w:ind w:left="400" w:hanging="400"/>
       </w:pPr>
-      <w:bookmarkStart w:name="src_W21" w:id="170"/>
+      <w:bookmarkStart w:name="src_W22" w:id="170"/>
       <w:r>
         <w:rPr>
           <w:rFonts w:ascii="Quicksand Medium" w:cs="Quicksand Medium" w:eastAsia="Quicksand Medium" w:hAnsi="Quicksand Medium"/>
@@ -20353,7 +20391,7 @@
           <w:sz w:val="14"/>
           <w:szCs w:val="14"/>
         </w:rPr>
-        <w:t xml:space="preserve">W21  </w:t>
+        <w:t xml:space="preserve">W22  </w:t>
       </w:r>
       <w:bookmarkEnd w:id="170"/>
       <w:r>
@@ -20363,9 +20401,47 @@
           <w:sz w:val="14"/>
           <w:szCs w:val="14"/>
         </w:rPr>
+        <w:t xml:space="preserve">Wolters Kluwer, 2026 half-year report (MFN): equity €940m, net debt €4,024m, gross debt €5,548m, net debt/EBITDA 2.0x at 30 June 2026. </w:t>
+      </w:r>
+      <w:hyperlink w:history="1" r:id="rIdf1ga_8645unsmylkjsmzr">
+        <w:r>
+          <w:rPr>
+            <w:rFonts w:ascii="Quicksand Light" w:cs="Quicksand Light" w:eastAsia="Quicksand Light" w:hAnsi="Quicksand Light"/>
+            <w:color w:val="C21A27"/>
+            <w:sz w:val="13"/>
+            <w:szCs w:val="13"/>
+            <w:u w:val="single"/>
+          </w:rPr>
+          <w:t xml:space="preserve">mfn.se link</w:t>
+        </w:r>
+      </w:hyperlink>
+    </w:p>
+    <w:p>
+      <w:pPr>
+        <w:spacing w:after="6" w:before="0" w:line="204" w:lineRule="auto"/>
+        <w:ind w:left="400" w:hanging="400"/>
+      </w:pPr>
+      <w:bookmarkStart w:name="src_W21" w:id="171"/>
+      <w:r>
+        <w:rPr>
+          <w:rFonts w:ascii="Quicksand Medium" w:cs="Quicksand Medium" w:eastAsia="Quicksand Medium" w:hAnsi="Quicksand Medium"/>
+          <w:color w:val="C21A27"/>
+          <w:sz w:val="14"/>
+          <w:szCs w:val="14"/>
+        </w:rPr>
+        <w:t xml:space="preserve">W21  </w:t>
+      </w:r>
+      <w:bookmarkEnd w:id="171"/>
+      <w:r>
+        <w:rPr>
+          <w:rFonts w:ascii="Quicksand Light" w:cs="Quicksand Light" w:eastAsia="Quicksand Light" w:hAnsi="Quicksand Light"/>
+          <w:color w:val="000000"/>
+          <w:sz w:val="14"/>
+          <w:szCs w:val="14"/>
+        </w:rPr>
         <w:t xml:space="preserve">Yahoo Finance (Reuters), "Wolters Kluwer’s long-time CEO McKinstry to retire, shares tumble" (February 2025): shares near €159. </w:t>
       </w:r>
-      <w:hyperlink w:history="1" r:id="rIdhkk_a6mfxkkbjzdofdj_b">
+      <w:hyperlink w:history="1" r:id="rIdcj-t-2cnw6zov_tgevwwb">
         <w:r>
           <w:rPr>
             <w:rFonts w:ascii="Quicksand Light" w:cs="Quicksand Light" w:eastAsia="Quicksand Light" w:hAnsi="Quicksand Light"/>

</xml_diff>